<commit_message>
docs: 중간 산출물 보고서 CR-P1-MON-01-01/02 일정 확정 반영 (PR #92)
FDS_Interim_Deliverable_Report_v3.1.20.docx §2 표의 CR-P1-MON-01-01/02 "일정 미확정" 항목을 Start 2026-09-11 · End 2026-10-06 확정으로 정정(GitHub Issue #74/#75 동기화 완료 반영). Manifest/SHA256SUMS 재계산. 독립 리뷰 승인(hayeounglee).
</commit_message>
<xml_diff>
--- a/releases/v3.1.20/reports/FDS_Interim_Deliverable_Report_v3.1.20.docx
+++ b/releases/v3.1.20/reports/FDS_Interim_Deliverable_Report_v3.1.20.docx
@@ -337,7 +337,7 @@
                 <w:b w:val="false"/>
                 <w:bCs w:val="false"/>
               </w:rPr>
-              <w:t xml:space="preserve">일정 미확정 (진행 중)</w:t>
+              <w:t xml:space="preserve">일정 확정 (2026-09-23 갱신)</w:t>
             </w:r>
           </w:p>
         </w:tc>
@@ -371,7 +371,7 @@
                 <w:b w:val="false"/>
                 <w:bCs w:val="false"/>
               </w:rPr>
-              <w:t xml:space="preserve">CR-P1-MON-01-01/02, Alertmanager Egress 관련 Change Request</w:t>
+              <w:t xml:space="preserve">CR-P1-MON-01-01/02, Alertmanager Egress 관련 Change Request. Start 2026-09-11 · End 2026-10-06으로 확정(GitHub Issue #74/#75 본문·네이티브 필드 동기화 완료, 2026-09-23)</w:t>
             </w:r>
           </w:p>
         </w:tc>

</xml_diff>